<commit_message>
feat: add storefront source discovery contracts
</commit_message>
<xml_diff>
--- a/docs/VESKIFY_SDD_v1.2.docx
+++ b/docs/VESKIFY_SDD_v1.2.docx
@@ -12309,6 +12309,17 @@
           <w:sz-cs w:val="24"/>
         </w:rPr>
         <w:t xml:space="preserve"/>
+      </w:r>
+    </w:p>
+    <w:p>
+      <w:pPr/>
+      <w:r>
+        <w:rPr>
+          <w:rFonts w:ascii="Helvetica Light" w:hAnsi="Helvetica Light" w:cs="Helvetica Light"/>
+          <w:sz w:val="24"/>
+          <w:sz-cs w:val="24"/>
+        </w:rPr>
+        <w:t xml:space="preserve">P7-01 implementation note: The provider-independent source-discovery package now defines validated source references, evidence and asset provenance, canonical-commerce reconciliation, reviewable brand reconstruction and merchant-approved Storefront Design Brief lifecycle contracts. The deterministic mock adapter is the only discovery implementation in this slice; real crawling and merchant UI remain future adapter/product work.</w:t>
       </w:r>
     </w:p>
     <w:p>

</xml_diff>

<commit_message>
feat: persist URL design brief workflow
</commit_message>
<xml_diff>
--- a/docs/VESKIFY_SDD_v1.2.docx
+++ b/docs/VESKIFY_SDD_v1.2.docx
@@ -1,6 +1,6 @@
 
 <file path=word/document.xml><?xml version="1.0" encoding="utf-8"?>
-<w:document xmlns:ve="http://schemas.openxmlformats.org/markup-compatibility/2006" xmlns:o="urn:schemas-microsoft-com:office:office" xmlns:r="http://schemas.openxmlformats.org/officeDocument/2006/relationships" xmlns:v="urn:schemas-microsoft-com:vml" xmlns:wp="http://schemas.openxmlformats.org/drawingml/2006/wordprocessingDrawing" xmlns:w10="urn:schemas-microsoft-com:office:word" xmlns:w="http://schemas.openxmlformats.org/wordprocessingml/2006/main">
+<w:document xmlns:w="http://schemas.openxmlformats.org/wordprocessingml/2006/main">
   <w:body>
     <w:p>
       <w:pPr/>
@@ -12320,6 +12320,17 @@
           <w:sz-cs w:val="24"/>
         </w:rPr>
         <w:t xml:space="preserve">P7-01 implementation note: The provider-independent source-discovery package now defines validated source references, evidence and asset provenance, canonical-commerce reconciliation, reviewable brand reconstruction and merchant-approved Storefront Design Brief lifecycle contracts. The deterministic mock adapter is the only discovery implementation in this slice; real crawling and merchant UI remain future adapter/product work.</w:t>
+      </w:r>
+    </w:p>
+    <w:p>
+      <w:pPr/>
+      <w:r>
+        <w:rPr>
+          <w:rFonts w:ascii="Helvetica Light" w:hAnsi="Helvetica Light" w:cs="Helvetica Light"/>
+          <w:sz w:val="24"/>
+          <w:sz-cs w:val="24"/>
+        </w:rPr>
+        <w:t xml:space="preserve">P7-02 implementation note: The existing persisted onboarding aggregate now owns a provider-independent URL-to-brief workflow with resumable discovery, canonical Vesko reconciliation, merchant decisions, evidence-fingerprint approval, staleness detection and superseding brief revisions. Local and focused-test operation uses the deterministic discovery adapter and must not be presented as a real crawl; production crawling and merchant-facing presentation remain separate adapter and W4 work.</w:t>
       </w:r>
     </w:p>
     <w:p>

</xml_diff>

<commit_message>
fix: address dynamic PDP review findings
</commit_message>
<xml_diff>
--- a/docs/VESKIFY_SDD_v1.2.docx
+++ b/docs/VESKIFY_SDD_v1.2.docx
@@ -7765,6 +7765,336 @@
           <w:sz w:val="24"/>
           <w:sz-cs w:val="24"/>
         </w:rPr>
+        <w:t xml:space="preserve">## 9.6 Registered `dynamicProductDetail` contract</w:t>
+      </w:r>
+    </w:p>
+    <w:p>
+      <w:pPr/>
+      <w:r>
+        <w:rPr>
+          <w:rFonts w:ascii="Helvetica Light" w:hAnsi="Helvetica Light" w:cs="Helvetica Light"/>
+          <w:sz w:val="24"/>
+          <w:sz-cs w:val="24"/>
+        </w:rPr>
+        <w:t xml:space="preserve">The `dynamicProductDetail` type is the registered `ComponentDefinitionV2` commerce family for the</w:t>
+      </w:r>
+    </w:p>
+    <w:p>
+      <w:pPr/>
+      <w:r>
+        <w:rPr>
+          <w:rFonts w:ascii="Helvetica Light" w:hAnsi="Helvetica Light" w:cs="Helvetica Light"/>
+          <w:sz w:val="24"/>
+          <w:sz-cs w:val="24"/>
+        </w:rPr>
+        <w:t xml:space="preserve">product-detail shell. Its required, revision-bound `primaryProduct` slot accepts one canonical</w:t>
+      </w:r>
+    </w:p>
+    <w:p>
+      <w:pPr/>
+      <w:r>
+        <w:rPr>
+          <w:rFonts w:ascii="Helvetica Light" w:hAnsi="Helvetica Light" w:cs="Helvetica Light"/>
+          <w:sz w:val="24"/>
+          <w:sz-cs w:val="24"/>
+        </w:rPr>
+        <w:t xml:space="preserve">product binding. Its optional, revision-bound `relatedProducts` slot accepts an ordered canonical</w:t>
+      </w:r>
+    </w:p>
+    <w:p>
+      <w:pPr/>
+      <w:r>
+        <w:rPr>
+          <w:rFonts w:ascii="Helvetica Light" w:hAnsi="Helvetica Light" w:cs="Helvetica Light"/>
+          <w:sz w:val="24"/>
+          <w:sz-cs w:val="24"/>
+        </w:rPr>
+        <w:t xml:space="preserve">product-list binding; when the slot is omitted the related-products region is hidden, and when it is</w:t>
+      </w:r>
+    </w:p>
+    <w:p>
+      <w:pPr/>
+      <w:r>
+        <w:rPr>
+          <w:rFonts w:ascii="Helvetica Light" w:hAnsi="Helvetica Light" w:cs="Helvetica Light"/>
+          <w:sz w:val="24"/>
+          <w:sz-cs w:val="24"/>
+        </w:rPr>
+        <w:t xml:space="preserve">present its IDs must exactly match the approved `ProductPresentationContext.relatedProductIds`.</w:t>
+      </w:r>
+    </w:p>
+    <w:p>
+      <w:pPr/>
+      <w:r>
+        <w:rPr>
+          <w:rFonts w:ascii="Helvetica Light" w:hAnsi="Helvetica Light" w:cs="Helvetica Light"/>
+          <w:sz w:val="24"/>
+          <w:sz-cs w:val="24"/>
+        </w:rPr>
+        <w:t xml:space="preserve"/>
+      </w:r>
+    </w:p>
+    <w:p>
+      <w:pPr/>
+      <w:r>
+        <w:rPr>
+          <w:rFonts w:ascii="Helvetica Light" w:hAnsi="Helvetica Light" w:cs="Helvetica Light"/>
+          <w:sz w:val="24"/>
+          <w:sz-cs w:val="24"/>
+        </w:rPr>
+        <w:t xml:space="preserve">The optional `productMedia` asset slot accepts approved product-main, product-alternative and</w:t>
+      </w:r>
+    </w:p>
+    <w:p>
+      <w:pPr/>
+      <w:r>
+        <w:rPr>
+          <w:rFonts w:ascii="Helvetica Light" w:hAnsi="Helvetica Light" w:cs="Helvetica Light"/>
+          <w:sz w:val="24"/>
+          <w:sz-cs w:val="24"/>
+        </w:rPr>
+        <w:t xml:space="preserve">editorial media. Explicit assignments must exactly cover the media used by the bound product,</w:t>
+      </w:r>
+    </w:p>
+    <w:p>
+      <w:pPr/>
+      <w:r>
+        <w:rPr>
+          <w:rFonts w:ascii="Helvetica Light" w:hAnsi="Helvetica Light" w:cs="Helvetica Light"/>
+          <w:sz w:val="24"/>
+          <w:sz-cs w:val="24"/>
+        </w:rPr>
+        <w:t xml:space="preserve">option choices and any bound related products. When assignments are omitted, the renderer may use</w:t>
+      </w:r>
+    </w:p>
+    <w:p>
+      <w:pPr/>
+      <w:r>
+        <w:rPr>
+          <w:rFonts w:ascii="Helvetica Light" w:hAnsi="Helvetica Light" w:cs="Helvetica Light"/>
+          <w:sz w:val="24"/>
+          <w:sz-cs w:val="24"/>
+        </w:rPr>
+        <w:t xml:space="preserve">only canonical media references already present in `ProductPresentationContext` and approved by the</w:t>
+      </w:r>
+    </w:p>
+    <w:p>
+      <w:pPr/>
+      <w:r>
+        <w:rPr>
+          <w:rFonts w:ascii="Helvetica Light" w:hAnsi="Helvetica Light" w:cs="Helvetica Light"/>
+          <w:sz w:val="24"/>
+          <w:sz-cs w:val="24"/>
+        </w:rPr>
+        <w:t xml:space="preserve">projection asset inventory. Unknown, rejected, unapproved or wrong-role assets fail conformance;</w:t>
+      </w:r>
+    </w:p>
+    <w:p>
+      <w:pPr/>
+      <w:r>
+        <w:rPr>
+          <w:rFonts w:ascii="Helvetica Light" w:hAnsi="Helvetica Light" w:cs="Helvetica Light"/>
+          <w:sz w:val="24"/>
+          <w:sz-cs w:val="24"/>
+        </w:rPr>
+        <w:t xml:space="preserve">products with no media render a localized empty state without copying media into editable content or</w:t>
+      </w:r>
+    </w:p>
+    <w:p>
+      <w:pPr/>
+      <w:r>
+        <w:rPr>
+          <w:rFonts w:ascii="Helvetica Light" w:hAnsi="Helvetica Light" w:cs="Helvetica Light"/>
+          <w:sz w:val="24"/>
+          <w:sz-cs w:val="24"/>
+        </w:rPr>
+        <w:t xml:space="preserve">props.</w:t>
+      </w:r>
+    </w:p>
+    <w:p>
+      <w:pPr/>
+      <w:r>
+        <w:rPr>
+          <w:rFonts w:ascii="Helvetica Light" w:hAnsi="Helvetica Light" w:cs="Helvetica Light"/>
+          <w:sz w:val="24"/>
+          <w:sz-cs w:val="24"/>
+        </w:rPr>
+        <w:t xml:space="preserve"/>
+      </w:r>
+    </w:p>
+    <w:p>
+      <w:pPr/>
+      <w:r>
+        <w:rPr>
+          <w:rFonts w:ascii="Helvetica Light" w:hAnsi="Helvetica Light" w:cs="Helvetica Light"/>
+          <w:sz w:val="24"/>
+          <w:sz-cs w:val="24"/>
+        </w:rPr>
+        <w:t xml:space="preserve">The default presentation is the `balanced` variant with thumbnail gallery, comfortable option</w:t>
+      </w:r>
+    </w:p>
+    <w:p>
+      <w:pPr/>
+      <w:r>
+        <w:rPr>
+          <w:rFonts w:ascii="Helvetica Light" w:hAnsi="Helvetica Light" w:cs="Helvetica Light"/>
+          <w:sz w:val="24"/>
+          <w:sz-cs w:val="24"/>
+        </w:rPr>
+        <w:t xml:space="preserve">spacing, grouped attributes, visible description and SKU, sticky mobile action and a plain surface.</w:t>
+      </w:r>
+    </w:p>
+    <w:p>
+      <w:pPr/>
+      <w:r>
+        <w:rPr>
+          <w:rFonts w:ascii="Helvetica Light" w:hAnsi="Helvetica Light" w:cs="Helvetica Light"/>
+          <w:sz w:val="24"/>
+          <w:sz-cs w:val="24"/>
+        </w:rPr>
+        <w:t xml:space="preserve">The same engineering-owned React implementation serves editor, preview and published targets.</w:t>
+      </w:r>
+    </w:p>
+    <w:p>
+      <w:pPr/>
+      <w:r>
+        <w:rPr>
+          <w:rFonts w:ascii="Helvetica Light" w:hAnsi="Helvetica Light" w:cs="Helvetica Light"/>
+          <w:sz w:val="24"/>
+          <w:sz-cs w:val="24"/>
+        </w:rPr>
+        <w:t xml:space="preserve">Option-selection, text-entry and primary-action intent callbacks are presentation boundaries only:</w:t>
+      </w:r>
+    </w:p>
+    <w:p>
+      <w:pPr/>
+      <w:r>
+        <w:rPr>
+          <w:rFonts w:ascii="Helvetica Light" w:hAnsi="Helvetica Light" w:cs="Helvetica Light"/>
+          <w:sz w:val="24"/>
+          <w:sz-cs w:val="24"/>
+        </w:rPr>
+        <w:t xml:space="preserve">the component performs no option resolution, cart, pricing, stock, inventory or checkout mutation.</w:t>
+      </w:r>
+    </w:p>
+    <w:p>
+      <w:pPr/>
+      <w:r>
+        <w:rPr>
+          <w:rFonts w:ascii="Helvetica Light" w:hAnsi="Helvetica Light" w:cs="Helvetica Light"/>
+          <w:sz w:val="24"/>
+          <w:sz-cs w:val="24"/>
+        </w:rPr>
+        <w:t xml:space="preserve">The primary-action intent carries canonical product/revision and resolved configuration/selection</w:t>
+      </w:r>
+    </w:p>
+    <w:p>
+      <w:pPr/>
+      <w:r>
+        <w:rPr>
+          <w:rFonts w:ascii="Helvetica Light" w:hAnsi="Helvetica Light" w:cs="Helvetica Light"/>
+          <w:sz w:val="24"/>
+          <w:sz-cs w:val="24"/>
+        </w:rPr>
+        <w:t xml:space="preserve">identity for a future Vesko commerce adapter.</w:t>
+      </w:r>
+    </w:p>
+    <w:p>
+      <w:pPr/>
+      <w:r>
+        <w:rPr>
+          <w:rFonts w:ascii="Helvetica Light" w:hAnsi="Helvetica Light" w:cs="Helvetica Light"/>
+          <w:sz w:val="24"/>
+          <w:sz-cs w:val="24"/>
+        </w:rPr>
+        <w:t xml:space="preserve"/>
+      </w:r>
+    </w:p>
+    <w:p>
+      <w:pPr/>
+      <w:r>
+        <w:rPr>
+          <w:rFonts w:ascii="Helvetica Light" w:hAnsi="Helvetica Light" w:cs="Helvetica Light"/>
+          <w:sz w:val="24"/>
+          <w:sz-cs w:val="24"/>
+        </w:rPr>
+        <w:t xml:space="preserve">Product identity, SKU, price, compare-at price, availability, option values/dependencies and asset</w:t>
+      </w:r>
+    </w:p>
+    <w:p>
+      <w:pPr/>
+      <w:r>
+        <w:rPr>
+          <w:rFonts w:ascii="Helvetica Light" w:hAnsi="Helvetica Light" w:cs="Helvetica Light"/>
+          <w:sz w:val="24"/>
+          <w:sz-cs w:val="24"/>
+        </w:rPr>
+        <w:t xml:space="preserve">provenance remain protected read-only commerce fields. The renderer consumes the current validated</w:t>
+      </w:r>
+    </w:p>
+    <w:p>
+      <w:pPr/>
+      <w:r>
+        <w:rPr>
+          <w:rFonts w:ascii="Helvetica Light" w:hAnsi="Helvetica Light" w:cs="Helvetica Light"/>
+          <w:sz w:val="24"/>
+          <w:sz-cs w:val="24"/>
+        </w:rPr>
+        <w:t xml:space="preserve">result from the P6 option-resolution engine, including selected values, incomplete required groups,</w:t>
+      </w:r>
+    </w:p>
+    <w:p>
+      <w:pPr/>
+      <w:r>
+        <w:rPr>
+          <w:rFonts w:ascii="Helvetica Light" w:hAnsi="Helvetica Light" w:cs="Helvetica Light"/>
+          <w:sz w:val="24"/>
+          <w:sz-cs w:val="24"/>
+        </w:rPr>
+        <w:t xml:space="preserve">dependency state, unavailable combinations and disabled reasons. It does not traverse dependencies,</w:t>
+      </w:r>
+    </w:p>
+    <w:p>
+      <w:pPr/>
+      <w:r>
+        <w:rPr>
+          <w:rFonts w:ascii="Helvetica Light" w:hAnsi="Helvetica Light" w:cs="Helvetica Light"/>
+          <w:sz w:val="24"/>
+          <w:sz-cs w:val="24"/>
+        </w:rPr>
+        <w:t xml:space="preserve">calculate price or resolve variants in React; disabled guidance is localized for EN/FI before it is</w:t>
+      </w:r>
+    </w:p>
+    <w:p>
+      <w:pPr/>
+      <w:r>
+        <w:rPr>
+          <w:rFonts w:ascii="Helvetica Light" w:hAnsi="Helvetica Light" w:cs="Helvetica Light"/>
+          <w:sz w:val="24"/>
+          <w:sz-cs w:val="24"/>
+        </w:rPr>
+        <w:t xml:space="preserve">shown or exposed through accessible descriptions.</w:t>
+      </w:r>
+    </w:p>
+    <w:p>
+      <w:pPr/>
+      <w:r>
+        <w:rPr>
+          <w:rFonts w:ascii="Helvetica Light" w:hAnsi="Helvetica Light" w:cs="Helvetica Light"/>
+          <w:sz w:val="24"/>
+          <w:sz-cs w:val="24"/>
+        </w:rPr>
+        <w:t xml:space="preserve"/>
+      </w:r>
+    </w:p>
+    <w:p>
+      <w:pPr/>
+      <w:r>
+        <w:rPr>
+          <w:rFonts w:ascii="Helvetica Light" w:hAnsi="Helvetica Light" w:cs="Helvetica Light"/>
+          <w:sz w:val="24"/>
+          <w:sz-cs w:val="24"/>
+        </w:rPr>
         <w:t xml:space="preserve"># 10. Dynamic product-detail page system</w:t>
       </w:r>
     </w:p>
@@ -11043,6 +11373,83 @@
           <w:sz w:val="24"/>
           <w:sz-cs w:val="24"/>
         </w:rPr>
+        <w:t xml:space="preserve">## 14.4 DS-01 foundation</w:t>
+      </w:r>
+    </w:p>
+    <w:p>
+      <w:pPr/>
+      <w:r>
+        <w:rPr>
+          <w:rFonts w:ascii="Helvetica Light" w:hAnsi="Helvetica Light" w:cs="Helvetica Light"/>
+          <w:sz w:val="24"/>
+          <w:sz-cs w:val="24"/>
+        </w:rPr>
+        <w:t xml:space="preserve">The DS-01 implementation provides the shared Vesko UI layer and the first Storefront Studio shell</w:t>
+      </w:r>
+    </w:p>
+    <w:p>
+      <w:pPr/>
+      <w:r>
+        <w:rPr>
+          <w:rFonts w:ascii="Helvetica Light" w:hAnsi="Helvetica Light" w:cs="Helvetica Light"/>
+          <w:sz w:val="24"/>
+          <w:sz-cs w:val="24"/>
+        </w:rPr>
+        <w:t xml:space="preserve">proof. The normal merchant entry route and onboarding/editor workspace use shared primitives for</w:t>
+      </w:r>
+    </w:p>
+    <w:p>
+      <w:pPr/>
+      <w:r>
+        <w:rPr>
+          <w:rFonts w:ascii="Helvetica Light" w:hAnsi="Helvetica Light" w:cs="Helvetica Light"/>
+          <w:sz w:val="24"/>
+          <w:sz-cs w:val="24"/>
+        </w:rPr>
+        <w:t xml:space="preserve">navigation, cards, actions, notices and status presentation. Existing canonical onboarding, draft,</w:t>
+      </w:r>
+    </w:p>
+    <w:p>
+      <w:pPr/>
+      <w:r>
+        <w:rPr>
+          <w:rFonts w:ascii="Helvetica Light" w:hAnsi="Helvetica Light" w:cs="Helvetica Light"/>
+          <w:sz w:val="24"/>
+          <w:sz-cs w:val="24"/>
+        </w:rPr>
+        <w:t xml:space="preserve">published, save, publish, history, AI proposal and Puck boundaries remain authoritative; the UI layer</w:t>
+      </w:r>
+    </w:p>
+    <w:p>
+      <w:pPr/>
+      <w:r>
+        <w:rPr>
+          <w:rFonts w:ascii="Helvetica Light" w:hAnsi="Helvetica Light" w:cs="Helvetica Light"/>
+          <w:sz w:val="24"/>
+          <w:sz-cs w:val="24"/>
+        </w:rPr>
+        <w:t xml:space="preserve">does not create a second state or persistence path.</w:t>
+      </w:r>
+    </w:p>
+    <w:p>
+      <w:pPr/>
+      <w:r>
+        <w:rPr>
+          <w:rFonts w:ascii="Helvetica Light" w:hAnsi="Helvetica Light" w:cs="Helvetica Light"/>
+          <w:sz w:val="24"/>
+          <w:sz-cs w:val="24"/>
+        </w:rPr>
+        <w:t xml:space="preserve"/>
+      </w:r>
+    </w:p>
+    <w:p>
+      <w:pPr/>
+      <w:r>
+        <w:rPr>
+          <w:rFonts w:ascii="Helvetica Light" w:hAnsi="Helvetica Light" w:cs="Helvetica Light"/>
+          <w:sz w:val="24"/>
+          <w:sz-cs w:val="24"/>
+        </w:rPr>
         <w:t xml:space="preserve"># 15. Data model and contracts</w:t>
       </w:r>
     </w:p>
@@ -12319,7 +12726,18 @@
           <w:sz w:val="24"/>
           <w:sz-cs w:val="24"/>
         </w:rPr>
-        <w:t xml:space="preserve">P7-01 implementation note: The provider-independent source-discovery package now defines validated source references, evidence and asset provenance, canonical-commerce reconciliation, reviewable brand reconstruction and merchant-approved Storefront Design Brief lifecycle contracts. The deterministic mock adapter is the only discovery implementation in this slice; real crawling and merchant UI remain future adapter/product work.</w:t>
+        <w:t xml:space="preserve">**P7-01 implementation note:** The provider-independent source-discovery package now defines validated source references, evidence and asset provenance, canonical-commerce reconciliation, reviewable brand reconstruction and merchant-approved Storefront Design Brief lifecycle contracts. The deterministic mock adapter is the only discovery implementation in this slice; real crawling and merchant UI remain future adapter/product work.</w:t>
+      </w:r>
+    </w:p>
+    <w:p>
+      <w:pPr/>
+      <w:r>
+        <w:rPr>
+          <w:rFonts w:ascii="Helvetica Light" w:hAnsi="Helvetica Light" w:cs="Helvetica Light"/>
+          <w:sz w:val="24"/>
+          <w:sz-cs w:val="24"/>
+        </w:rPr>
+        <w:t xml:space="preserve"/>
       </w:r>
     </w:p>
     <w:p>

</xml_diff>

<commit_message>
feat: add dynamic collection commerce components
</commit_message>
<xml_diff>
--- a/docs/VESKIFY_SDD_v1.2.docx
+++ b/docs/VESKIFY_SDD_v1.2.docx
@@ -8095,6 +8095,391 @@
           <w:sz w:val="24"/>
           <w:sz-cs w:val="24"/>
         </w:rPr>
+        <w:t xml:space="preserve">## 9.7 Registered `dynamicCollectionCommerce` contract</w:t>
+      </w:r>
+    </w:p>
+    <w:p>
+      <w:pPr/>
+      <w:r>
+        <w:rPr>
+          <w:rFonts w:ascii="Helvetica Light" w:hAnsi="Helvetica Light" w:cs="Helvetica Light"/>
+          <w:sz w:val="24"/>
+          <w:sz-cs w:val="24"/>
+        </w:rPr>
+        <w:t xml:space="preserve">The `dynamicCollectionCommerce` type is the registered `ComponentDefinitionV2` commerce family for</w:t>
+      </w:r>
+    </w:p>
+    <w:p>
+      <w:pPr/>
+      <w:r>
+        <w:rPr>
+          <w:rFonts w:ascii="Helvetica Light" w:hAnsi="Helvetica Light" w:cs="Helvetica Light"/>
+          <w:sz w:val="24"/>
+          <w:sz-cs w:val="24"/>
+        </w:rPr>
+        <w:t xml:space="preserve">collection headers, product grids/cards, collection filters, sorting and optional child-collection</w:t>
+      </w:r>
+    </w:p>
+    <w:p>
+      <w:pPr/>
+      <w:r>
+        <w:rPr>
+          <w:rFonts w:ascii="Helvetica Light" w:hAnsi="Helvetica Light" w:cs="Helvetica Light"/>
+          <w:sz w:val="24"/>
+          <w:sz-cs w:val="24"/>
+        </w:rPr>
+        <w:t xml:space="preserve">navigation. Its required, revision-bound `primaryCollection` slot accepts one canonical collection</w:t>
+      </w:r>
+    </w:p>
+    <w:p>
+      <w:pPr/>
+      <w:r>
+        <w:rPr>
+          <w:rFonts w:ascii="Helvetica Light" w:hAnsi="Helvetica Light" w:cs="Helvetica Light"/>
+          <w:sz w:val="24"/>
+          <w:sz-cs w:val="24"/>
+        </w:rPr>
+        <w:t xml:space="preserve">binding. Its required, revision-bound `collectionProducts` slot accepts the ordered canonical</w:t>
+      </w:r>
+    </w:p>
+    <w:p>
+      <w:pPr/>
+      <w:r>
+        <w:rPr>
+          <w:rFonts w:ascii="Helvetica Light" w:hAnsi="Helvetica Light" w:cs="Helvetica Light"/>
+          <w:sz w:val="24"/>
+          <w:sz-cs w:val="24"/>
+        </w:rPr>
+        <w:t xml:space="preserve">product-list binding and must exactly match the bound collection's membership and order, including</w:t>
+      </w:r>
+    </w:p>
+    <w:p>
+      <w:pPr/>
+      <w:r>
+        <w:rPr>
+          <w:rFonts w:ascii="Helvetica Light" w:hAnsi="Helvetica Light" w:cs="Helvetica Light"/>
+          <w:sz w:val="24"/>
+          <w:sz-cs w:val="24"/>
+        </w:rPr>
+        <w:t xml:space="preserve">the valid empty-list case. The optional, revision-bound `childCollections` slot accepts an ordered</w:t>
+      </w:r>
+    </w:p>
+    <w:p>
+      <w:pPr/>
+      <w:r>
+        <w:rPr>
+          <w:rFonts w:ascii="Helvetica Light" w:hAnsi="Helvetica Light" w:cs="Helvetica Light"/>
+          <w:sz w:val="24"/>
+          <w:sz-cs w:val="24"/>
+        </w:rPr>
+        <w:t xml:space="preserve">canonical collection-list binding; when present it must exactly match the canonical child collection</w:t>
+      </w:r>
+    </w:p>
+    <w:p>
+      <w:pPr/>
+      <w:r>
+        <w:rPr>
+          <w:rFonts w:ascii="Helvetica Light" w:hAnsi="Helvetica Light" w:cs="Helvetica Light"/>
+          <w:sz w:val="24"/>
+          <w:sz-cs w:val="24"/>
+        </w:rPr>
+        <w:t xml:space="preserve">references, and when omitted the child-navigation region is hidden.</w:t>
+      </w:r>
+    </w:p>
+    <w:p>
+      <w:pPr/>
+      <w:r>
+        <w:rPr>
+          <w:rFonts w:ascii="Helvetica Light" w:hAnsi="Helvetica Light" w:cs="Helvetica Light"/>
+          <w:sz w:val="24"/>
+          <w:sz-cs w:val="24"/>
+        </w:rPr>
+        <w:t xml:space="preserve"/>
+      </w:r>
+    </w:p>
+    <w:p>
+      <w:pPr/>
+      <w:r>
+        <w:rPr>
+          <w:rFonts w:ascii="Helvetica Light" w:hAnsi="Helvetica Light" w:cs="Helvetica Light"/>
+          <w:sz w:val="24"/>
+          <w:sz-cs w:val="24"/>
+        </w:rPr>
+        <w:t xml:space="preserve">The optional `collectionCommerceMedia` asset slot accepts approved collection and product-main</w:t>
+      </w:r>
+    </w:p>
+    <w:p>
+      <w:pPr/>
+      <w:r>
+        <w:rPr>
+          <w:rFonts w:ascii="Helvetica Light" w:hAnsi="Helvetica Light" w:cs="Helvetica Light"/>
+          <w:sz w:val="24"/>
+          <w:sz-cs w:val="24"/>
+        </w:rPr>
+        <w:t xml:space="preserve">media. Explicit assignments must exactly cover the collection hero and first product-card media used</w:t>
+      </w:r>
+    </w:p>
+    <w:p>
+      <w:pPr/>
+      <w:r>
+        <w:rPr>
+          <w:rFonts w:ascii="Helvetica Light" w:hAnsi="Helvetica Light" w:cs="Helvetica Light"/>
+          <w:sz w:val="24"/>
+          <w:sz-cs w:val="24"/>
+        </w:rPr>
+        <w:t xml:space="preserve">by the renderer. When assignments are omitted, the renderer may use only canonical media references</w:t>
+      </w:r>
+    </w:p>
+    <w:p>
+      <w:pPr/>
+      <w:r>
+        <w:rPr>
+          <w:rFonts w:ascii="Helvetica Light" w:hAnsi="Helvetica Light" w:cs="Helvetica Light"/>
+          <w:sz w:val="24"/>
+          <w:sz-cs w:val="24"/>
+        </w:rPr>
+        <w:t xml:space="preserve">already present in the collection/product presentation contexts and approved by the projection asset</w:t>
+      </w:r>
+    </w:p>
+    <w:p>
+      <w:pPr/>
+      <w:r>
+        <w:rPr>
+          <w:rFonts w:ascii="Helvetica Light" w:hAnsi="Helvetica Light" w:cs="Helvetica Light"/>
+          <w:sz w:val="24"/>
+          <w:sz-cs w:val="24"/>
+        </w:rPr>
+        <w:t xml:space="preserve">inventory. Unknown, rejected, unapproved, unused or wrong-role assets fail conformance. Missing</w:t>
+      </w:r>
+    </w:p>
+    <w:p>
+      <w:pPr/>
+      <w:r>
+        <w:rPr>
+          <w:rFonts w:ascii="Helvetica Light" w:hAnsi="Helvetica Light" w:cs="Helvetica Light"/>
+          <w:sz w:val="24"/>
+          <w:sz-cs w:val="24"/>
+        </w:rPr>
+        <w:t xml:space="preserve">collection hero media is omitted safely, while missing product media uses a localized presentation</w:t>
+      </w:r>
+    </w:p>
+    <w:p>
+      <w:pPr/>
+      <w:r>
+        <w:rPr>
+          <w:rFonts w:ascii="Helvetica Light" w:hAnsi="Helvetica Light" w:cs="Helvetica Light"/>
+          <w:sz w:val="24"/>
+          <w:sz-cs w:val="24"/>
+        </w:rPr>
+        <w:t xml:space="preserve">placeholder without copying an asset or product fact into editable content.</w:t>
+      </w:r>
+    </w:p>
+    <w:p>
+      <w:pPr/>
+      <w:r>
+        <w:rPr>
+          <w:rFonts w:ascii="Helvetica Light" w:hAnsi="Helvetica Light" w:cs="Helvetica Light"/>
+          <w:sz w:val="24"/>
+          <w:sz-cs w:val="24"/>
+        </w:rPr>
+        <w:t xml:space="preserve"/>
+      </w:r>
+    </w:p>
+    <w:p>
+      <w:pPr/>
+      <w:r>
+        <w:rPr>
+          <w:rFonts w:ascii="Helvetica Light" w:hAnsi="Helvetica Light" w:cs="Helvetica Light"/>
+          <w:sz w:val="24"/>
+          <w:sz-cs w:val="24"/>
+        </w:rPr>
+        <w:t xml:space="preserve">The default presentation uses the `standard` family variant, standard grid density, standard cards,</w:t>
+      </w:r>
+    </w:p>
+    <w:p>
+      <w:pPr/>
+      <w:r>
+        <w:rPr>
+          <w:rFonts w:ascii="Helvetica Light" w:hAnsi="Helvetica Light" w:cs="Helvetica Light"/>
+          <w:sz w:val="24"/>
+          <w:sz-cs w:val="24"/>
+        </w:rPr>
+        <w:t xml:space="preserve">sidebar filters, visible collection description/product count/badges, up to two concise canonical</w:t>
+      </w:r>
+    </w:p>
+    <w:p>
+      <w:pPr/>
+      <w:r>
+        <w:rPr>
+          <w:rFonts w:ascii="Helvetica Light" w:hAnsi="Helvetica Light" w:cs="Helvetica Light"/>
+          <w:sz w:val="24"/>
+          <w:sz-cs w:val="24"/>
+        </w:rPr>
+        <w:t xml:space="preserve">attributes and optional child collections. Product-card variants and grid/filter presentation may</w:t>
+      </w:r>
+    </w:p>
+    <w:p>
+      <w:pPr/>
+      <w:r>
+        <w:rPr>
+          <w:rFonts w:ascii="Helvetica Light" w:hAnsi="Helvetica Light" w:cs="Helvetica Light"/>
+          <w:sz w:val="24"/>
+          <w:sz-cs w:val="24"/>
+        </w:rPr>
+        <w:t xml:space="preserve">change without changing collection membership. The canonical collection filter model may supply</w:t>
+      </w:r>
+    </w:p>
+    <w:p>
+      <w:pPr/>
+      <w:r>
+        <w:rPr>
+          <w:rFonts w:ascii="Helvetica Light" w:hAnsi="Helvetica Light" w:cs="Helvetica Light"/>
+          <w:sz w:val="24"/>
+          <w:sz-cs w:val="24"/>
+        </w:rPr>
+        <w:t xml:space="preserve">ordered enumerated values (selected, disabled and optional counts) or bounded numeric-range state,</w:t>
+      </w:r>
+    </w:p>
+    <w:p>
+      <w:pPr/>
+      <w:r>
+        <w:rPr>
+          <w:rFonts w:ascii="Helvetica Light" w:hAnsi="Helvetica Light" w:cs="Helvetica Light"/>
+          <w:sz w:val="24"/>
+          <w:sz-cs w:val="24"/>
+        </w:rPr>
+        <w:t xml:space="preserve">plus supported sort options, breadcrumbs and child collection references. Loading, empty and</w:t>
+      </w:r>
+    </w:p>
+    <w:p>
+      <w:pPr/>
+      <w:r>
+        <w:rPr>
+          <w:rFonts w:ascii="Helvetica Light" w:hAnsi="Helvetica Light" w:cs="Helvetica Light"/>
+          <w:sz w:val="24"/>
+          <w:sz-cs w:val="24"/>
+        </w:rPr>
+        <w:t xml:space="preserve">no-media states are presentation inputs; they do not query or repair commerce data.</w:t>
+      </w:r>
+    </w:p>
+    <w:p>
+      <w:pPr/>
+      <w:r>
+        <w:rPr>
+          <w:rFonts w:ascii="Helvetica Light" w:hAnsi="Helvetica Light" w:cs="Helvetica Light"/>
+          <w:sz w:val="24"/>
+          <w:sz-cs w:val="24"/>
+        </w:rPr>
+        <w:t xml:space="preserve"/>
+      </w:r>
+    </w:p>
+    <w:p>
+      <w:pPr/>
+      <w:r>
+        <w:rPr>
+          <w:rFonts w:ascii="Helvetica Light" w:hAnsi="Helvetica Light" w:cs="Helvetica Light"/>
+          <w:sz w:val="24"/>
+          <w:sz-cs w:val="24"/>
+        </w:rPr>
+        <w:t xml:space="preserve">The same engineering-owned React implementation serves editor, preview and published targets.</w:t>
+      </w:r>
+    </w:p>
+    <w:p>
+      <w:pPr/>
+      <w:r>
+        <w:rPr>
+          <w:rFonts w:ascii="Helvetica Light" w:hAnsi="Helvetica Light" w:cs="Helvetica Light"/>
+          <w:sz w:val="24"/>
+          <w:sz-cs w:val="24"/>
+        </w:rPr>
+        <w:t xml:space="preserve">Product/collection navigation, enumerated/range filtering, clear, clear-all and sorting emit typed</w:t>
+      </w:r>
+    </w:p>
+    <w:p>
+      <w:pPr/>
+      <w:r>
+        <w:rPr>
+          <w:rFonts w:ascii="Helvetica Light" w:hAnsi="Helvetica Light" w:cs="Helvetica Light"/>
+          <w:sz w:val="24"/>
+          <w:sz-cs w:val="24"/>
+        </w:rPr>
+        <w:t xml:space="preserve">presentation intents only. The component performs no product query, filter evaluation, sorting,</w:t>
+      </w:r>
+    </w:p>
+    <w:p>
+      <w:pPr/>
+      <w:r>
+        <w:rPr>
+          <w:rFonts w:ascii="Helvetica Light" w:hAnsi="Helvetica Light" w:cs="Helvetica Light"/>
+          <w:sz w:val="24"/>
+          <w:sz-cs w:val="24"/>
+        </w:rPr>
+        <w:t xml:space="preserve">inventory, pricing, stock, collection-membership or navigation mutation. Product identity, type,</w:t>
+      </w:r>
+    </w:p>
+    <w:p>
+      <w:pPr/>
+      <w:r>
+        <w:rPr>
+          <w:rFonts w:ascii="Helvetica Light" w:hAnsi="Helvetica Light" w:cs="Helvetica Light"/>
+          <w:sz w:val="24"/>
+          <w:sz-cs w:val="24"/>
+        </w:rPr>
+        <w:t xml:space="preserve">SKU, price, compare-at price, availability, collection membership/filter state and asset provenance</w:t>
+      </w:r>
+    </w:p>
+    <w:p>
+      <w:pPr/>
+      <w:r>
+        <w:rPr>
+          <w:rFonts w:ascii="Helvetica Light" w:hAnsi="Helvetica Light" w:cs="Helvetica Light"/>
+          <w:sz w:val="24"/>
+          <w:sz-cs w:val="24"/>
+        </w:rPr>
+        <w:t xml:space="preserve">remain protected read-only commerce fields. Merchant-facing labels resolve through canonical EN/FI</w:t>
+      </w:r>
+    </w:p>
+    <w:p>
+      <w:pPr/>
+      <w:r>
+        <w:rPr>
+          <w:rFonts w:ascii="Helvetica Light" w:hAnsi="Helvetica Light" w:cs="Helvetica Light"/>
+          <w:sz w:val="24"/>
+          <w:sz-cs w:val="24"/>
+        </w:rPr>
+        <w:t xml:space="preserve">localization. This contract traces to FR-102, FR-107, FR-109, FR-110, FR-112 and FR-114; NFR-101,</w:t>
+      </w:r>
+    </w:p>
+    <w:p>
+      <w:pPr/>
+      <w:r>
+        <w:rPr>
+          <w:rFonts w:ascii="Helvetica Light" w:hAnsi="Helvetica Light" w:cs="Helvetica Light"/>
+          <w:sz w:val="24"/>
+          <w:sz-cs w:val="24"/>
+        </w:rPr>
+        <w:t xml:space="preserve">NFR-102, NFR-103, NFR-108 and NFR-109; and AC-111, AC-112, AC-118, AC-122 and AC-123.</w:t>
+      </w:r>
+    </w:p>
+    <w:p>
+      <w:pPr/>
+      <w:r>
+        <w:rPr>
+          <w:rFonts w:ascii="Helvetica Light" w:hAnsi="Helvetica Light" w:cs="Helvetica Light"/>
+          <w:sz w:val="24"/>
+          <w:sz-cs w:val="24"/>
+        </w:rPr>
+        <w:t xml:space="preserve"/>
+      </w:r>
+    </w:p>
+    <w:p>
+      <w:pPr/>
+      <w:r>
+        <w:rPr>
+          <w:rFonts w:ascii="Helvetica Light" w:hAnsi="Helvetica Light" w:cs="Helvetica Light"/>
+          <w:sz w:val="24"/>
+          <w:sz-cs w:val="24"/>
+        </w:rPr>
         <w:t xml:space="preserve"># 10. Dynamic product-detail page system</w:t>
       </w:r>
     </w:p>
@@ -9712,7 +10097,29 @@
           <w:sz w:val="24"/>
           <w:sz-cs w:val="24"/>
         </w:rPr>
-        <w:t xml:space="preserve">- Filters derive from canonical attributes and product-type rules, not a hardcoded jewellery filter list.</w:t>
+        <w:t xml:space="preserve">- Filters consume ordered canonical enumerated or range presentation state, including selected,</w:t>
+      </w:r>
+    </w:p>
+    <w:p>
+      <w:pPr/>
+      <w:r>
+        <w:rPr>
+          <w:rFonts w:ascii="Helvetica Light" w:hAnsi="Helvetica Light" w:cs="Helvetica Light"/>
+          <w:sz w:val="24"/>
+          <w:sz-cs w:val="24"/>
+        </w:rPr>
+        <w:t xml:space="preserve">  disabled and count state; they do not contain a hardcoded jewellery filter list or evaluate product</w:t>
+      </w:r>
+    </w:p>
+    <w:p>
+      <w:pPr/>
+      <w:r>
+        <w:rPr>
+          <w:rFonts w:ascii="Helvetica Light" w:hAnsi="Helvetica Light" w:cs="Helvetica Light"/>
+          <w:sz w:val="24"/>
+          <w:sz-cs w:val="24"/>
+        </w:rPr>
+        <w:t xml:space="preserve">  queries in React.</w:t>
       </w:r>
     </w:p>
     <w:p>
@@ -9756,6 +10163,28 @@
           <w:sz w:val="24"/>
           <w:sz-cs w:val="24"/>
         </w:rPr>
+        <w:t xml:space="preserve">- Sorting, filtering, clearing and product/collection navigation emit typed presentation intents only.</w:t>
+      </w:r>
+    </w:p>
+    <w:p>
+      <w:pPr/>
+      <w:r>
+        <w:rPr>
+          <w:rFonts w:ascii="Helvetica Light" w:hAnsi="Helvetica Light" w:cs="Helvetica Light"/>
+          <w:sz w:val="24"/>
+          <w:sz-cs w:val="24"/>
+        </w:rPr>
+        <w:t xml:space="preserve"/>
+      </w:r>
+    </w:p>
+    <w:p>
+      <w:pPr/>
+      <w:r>
+        <w:rPr>
+          <w:rFonts w:ascii="Helvetica Light" w:hAnsi="Helvetica Light" w:cs="Helvetica Light"/>
+          <w:sz w:val="24"/>
+          <w:sz-cs w:val="24"/>
+        </w:rPr>
         <w:t xml:space="preserve">- Grid density, card variant, merchandising rows and editorial modules may change without altering collection membership.</w:t>
       </w:r>
     </w:p>
@@ -9778,7 +10207,7 @@
           <w:sz w:val="24"/>
           <w:sz-cs w:val="24"/>
         </w:rPr>
-        <w:t xml:space="preserve">- No-results and incomplete-data states are intentionally designed.</w:t>
+        <w:t xml:space="preserve">- Loading, no-results, missing-hero and missing-product-media states are intentionally designed.</w:t>
       </w:r>
     </w:p>
     <w:p>

</xml_diff>

<commit_message>
feat: add safe public source discovery
</commit_message>
<xml_diff>
--- a/docs/VESKIFY_SDD_v1.2.docx
+++ b/docs/VESKIFY_SDD_v1.2.docx
@@ -1,6 +1,6 @@
 
 <file path=word/document.xml><?xml version="1.0" encoding="utf-8"?>
-<w:document xmlns:ve="http://schemas.openxmlformats.org/markup-compatibility/2006" xmlns:o="urn:schemas-microsoft-com:office:office" xmlns:r="http://schemas.openxmlformats.org/officeDocument/2006/relationships" xmlns:v="urn:schemas-microsoft-com:vml" xmlns:wp="http://schemas.openxmlformats.org/drawingml/2006/wordprocessingDrawing" xmlns:w10="urn:schemas-microsoft-com:office:word" xmlns:w="http://schemas.openxmlformats.org/wordprocessingml/2006/main">
+<w:document xmlns:w="http://schemas.openxmlformats.org/wordprocessingml/2006/main">
   <w:body>
     <w:p>
       <w:pPr/>
@@ -12749,6 +12749,17 @@
           <w:sz-cs w:val="24"/>
         </w:rPr>
         <w:t xml:space="preserve">**P7-02 implementation note:** The existing persisted onboarding aggregate now owns a provider-independent URL-to-brief workflow with resumable discovery, canonical Vesko reconciliation, merchant decisions, evidence-fingerprint approval, staleness detection and superseding brief revisions. Local and focused-test operation uses the deterministic discovery adapter and must not be presented as a real crawl; production crawling and merchant-facing presentation remain separate adapter and W4 work.</w:t>
+      </w:r>
+    </w:p>
+    <w:p>
+      <w:pPr/>
+      <w:r>
+        <w:rPr>
+          <w:rFonts w:ascii="Helvetica Light" w:hAnsi="Helvetica Light" w:cs="Helvetica Light"/>
+          <w:sz w:val="24"/>
+          <w:sz-cs w:val="24"/>
+        </w:rPr>
+        <w:t xml:space="preserve">**P7-03 implementation note:** The server-only public-source adapter inspects one bounded HTTPS document through strict URL, DNS, redirect, timeout, response-size and HTML content policies. DNS answers are validated and pinned for acquisition, public content remains inert source evidence, and remote media remains unapproved candidate metadata with provenance. Deterministic mode remains the default local/test path; the adapter is not a recursive crawler, does not execute page content and does not ingest remote binaries into approved media.</w:t>
       </w:r>
     </w:p>
     <w:p>

</xml_diff>

<commit_message>
fix: address collection commerce review findings
</commit_message>
<xml_diff>
--- a/docs/VESKIFY_SDD_v1.2.docx
+++ b/docs/VESKIFY_SDD_v1.2.docx
@@ -8205,73 +8205,117 @@
           <w:sz w:val="24"/>
           <w:sz-cs w:val="24"/>
         </w:rPr>
-        <w:t xml:space="preserve">The optional `collectionCommerceMedia` asset slot accepts approved collection and product-main</w:t>
-      </w:r>
-    </w:p>
-    <w:p>
-      <w:pPr/>
-      <w:r>
-        <w:rPr>
-          <w:rFonts w:ascii="Helvetica Light" w:hAnsi="Helvetica Light" w:cs="Helvetica Light"/>
-          <w:sz w:val="24"/>
-          <w:sz-cs w:val="24"/>
-        </w:rPr>
-        <w:t xml:space="preserve">media. Explicit assignments must exactly cover the collection hero and first product-card media used</w:t>
-      </w:r>
-    </w:p>
-    <w:p>
-      <w:pPr/>
-      <w:r>
-        <w:rPr>
-          <w:rFonts w:ascii="Helvetica Light" w:hAnsi="Helvetica Light" w:cs="Helvetica Light"/>
-          <w:sz w:val="24"/>
-          <w:sz-cs w:val="24"/>
-        </w:rPr>
-        <w:t xml:space="preserve">by the renderer. When assignments are omitted, the renderer may use only canonical media references</w:t>
-      </w:r>
-    </w:p>
-    <w:p>
-      <w:pPr/>
-      <w:r>
-        <w:rPr>
-          <w:rFonts w:ascii="Helvetica Light" w:hAnsi="Helvetica Light" w:cs="Helvetica Light"/>
-          <w:sz w:val="24"/>
-          <w:sz-cs w:val="24"/>
-        </w:rPr>
-        <w:t xml:space="preserve">already present in the collection/product presentation contexts and approved by the projection asset</w:t>
-      </w:r>
-    </w:p>
-    <w:p>
-      <w:pPr/>
-      <w:r>
-        <w:rPr>
-          <w:rFonts w:ascii="Helvetica Light" w:hAnsi="Helvetica Light" w:cs="Helvetica Light"/>
-          <w:sz w:val="24"/>
-          <w:sz-cs w:val="24"/>
-        </w:rPr>
-        <w:t xml:space="preserve">inventory. Unknown, rejected, unapproved, unused or wrong-role assets fail conformance. Missing</w:t>
-      </w:r>
-    </w:p>
-    <w:p>
-      <w:pPr/>
-      <w:r>
-        <w:rPr>
-          <w:rFonts w:ascii="Helvetica Light" w:hAnsi="Helvetica Light" w:cs="Helvetica Light"/>
-          <w:sz w:val="24"/>
-          <w:sz-cs w:val="24"/>
-        </w:rPr>
-        <w:t xml:space="preserve">collection hero media is omitted safely, while missing product media uses a localized presentation</w:t>
-      </w:r>
-    </w:p>
-    <w:p>
-      <w:pPr/>
-      <w:r>
-        <w:rPr>
-          <w:rFonts w:ascii="Helvetica Light" w:hAnsi="Helvetica Light" w:cs="Helvetica Light"/>
-          <w:sz w:val="24"/>
-          <w:sz-cs w:val="24"/>
-        </w:rPr>
-        <w:t xml:space="preserve">placeholder without copying an asset or product fact into editable content.</w:t>
+        <w:t xml:space="preserve">The optional `collectionCommerceMedia` asset slot accepts approved collection, product-main,</w:t>
+      </w:r>
+    </w:p>
+    <w:p>
+      <w:pPr/>
+      <w:r>
+        <w:rPr>
+          <w:rFonts w:ascii="Helvetica Light" w:hAnsi="Helvetica Light" w:cs="Helvetica Light"/>
+          <w:sz w:val="24"/>
+          <w:sz-cs w:val="24"/>
+        </w:rPr>
+        <w:t xml:space="preserve">product-alternative and editorial media. Product-card selection follows canonical media order and</w:t>
+      </w:r>
+    </w:p>
+    <w:p>
+      <w:pPr/>
+      <w:r>
+        <w:rPr>
+          <w:rFonts w:ascii="Helvetica Light" w:hAnsi="Helvetica Light" w:cs="Helvetica Light"/>
+          <w:sz w:val="24"/>
+          <w:sz-cs w:val="24"/>
+        </w:rPr>
+        <w:t xml:space="preserve">preserves the selected asset's actual canonical role; variant media uses the existing approved</w:t>
+      </w:r>
+    </w:p>
+    <w:p>
+      <w:pPr/>
+      <w:r>
+        <w:rPr>
+          <w:rFonts w:ascii="Helvetica Light" w:hAnsi="Helvetica Light" w:cs="Helvetica Light"/>
+          <w:sz w:val="24"/>
+          <w:sz-cs w:val="24"/>
+        </w:rPr>
+        <w:t xml:space="preserve">product-alternative role. If an item is not approved or its inventory role does not match its</w:t>
+      </w:r>
+    </w:p>
+    <w:p>
+      <w:pPr/>
+      <w:r>
+        <w:rPr>
+          <w:rFonts w:ascii="Helvetica Light" w:hAnsi="Helvetica Light" w:cs="Helvetica Light"/>
+          <w:sz w:val="24"/>
+          <w:sz-cs w:val="24"/>
+        </w:rPr>
+        <w:t xml:space="preserve">canonical media role, selection continues deterministically to the next compatible item. Explicit</w:t>
+      </w:r>
+    </w:p>
+    <w:p>
+      <w:pPr/>
+      <w:r>
+        <w:rPr>
+          <w:rFonts w:ascii="Helvetica Light" w:hAnsi="Helvetica Light" w:cs="Helvetica Light"/>
+          <w:sz w:val="24"/>
+          <w:sz-cs w:val="24"/>
+        </w:rPr>
+        <w:t xml:space="preserve">assignments must exactly cover the collection hero and product-card media used by the renderer, and</w:t>
+      </w:r>
+    </w:p>
+    <w:p>
+      <w:pPr/>
+      <w:r>
+        <w:rPr>
+          <w:rFonts w:ascii="Helvetica Light" w:hAnsi="Helvetica Light" w:cs="Helvetica Light"/>
+          <w:sz w:val="24"/>
+          <w:sz-cs w:val="24"/>
+        </w:rPr>
+        <w:t xml:space="preserve">unknown or unapproved explicit assignments fail conformance. When assignments are omitted, the</w:t>
+      </w:r>
+    </w:p>
+    <w:p>
+      <w:pPr/>
+      <w:r>
+        <w:rPr>
+          <w:rFonts w:ascii="Helvetica Light" w:hAnsi="Helvetica Light" w:cs="Helvetica Light"/>
+          <w:sz w:val="24"/>
+          <w:sz-cs w:val="24"/>
+        </w:rPr>
+        <w:t xml:space="preserve">renderer may use only compatible canonical media references already approved by the projection asset</w:t>
+      </w:r>
+    </w:p>
+    <w:p>
+      <w:pPr/>
+      <w:r>
+        <w:rPr>
+          <w:rFonts w:ascii="Helvetica Light" w:hAnsi="Helvetica Light" w:cs="Helvetica Light"/>
+          <w:sz w:val="24"/>
+          <w:sz-cs w:val="24"/>
+        </w:rPr>
+        <w:t xml:space="preserve">inventory. Missing collection hero media is omitted safely, while no compatible approved product</w:t>
+      </w:r>
+    </w:p>
+    <w:p>
+      <w:pPr/>
+      <w:r>
+        <w:rPr>
+          <w:rFonts w:ascii="Helvetica Light" w:hAnsi="Helvetica Light" w:cs="Helvetica Light"/>
+          <w:sz w:val="24"/>
+          <w:sz-cs w:val="24"/>
+        </w:rPr>
+        <w:t xml:space="preserve">media uses a localized presentation placeholder without copying an asset or product fact into</w:t>
+      </w:r>
+    </w:p>
+    <w:p>
+      <w:pPr/>
+      <w:r>
+        <w:rPr>
+          <w:rFonts w:ascii="Helvetica Light" w:hAnsi="Helvetica Light" w:cs="Helvetica Light"/>
+          <w:sz w:val="24"/>
+          <w:sz-cs w:val="24"/>
+        </w:rPr>
+        <w:t xml:space="preserve">editable content.</w:t>
       </w:r>
     </w:p>
     <w:p>
@@ -8403,7 +8447,51 @@
           <w:sz w:val="24"/>
           <w:sz-cs w:val="24"/>
         </w:rPr>
-        <w:t xml:space="preserve">presentation intents only. The component performs no product query, filter evaluation, sorting,</w:t>
+        <w:t xml:space="preserve">presentation intents only. Range controls reject malformed initial state and clamp finite,</w:t>
+      </w:r>
+    </w:p>
+    <w:p>
+      <w:pPr/>
+      <w:r>
+        <w:rPr>
+          <w:rFonts w:ascii="Helvetica Light" w:hAnsi="Helvetica Light" w:cs="Helvetica Light"/>
+          <w:sz w:val="24"/>
+          <w:sz-cs w:val="24"/>
+        </w:rPr>
+        <w:t xml:space="preserve">step-aligned active values to the canonical bounds and selected opposite bound before emitting; an</w:t>
+      </w:r>
+    </w:p>
+    <w:p>
+      <w:pPr/>
+      <w:r>
+        <w:rPr>
+          <w:rFonts w:ascii="Helvetica Light" w:hAnsi="Helvetica Light" w:cs="Helvetica Light"/>
+          <w:sz w:val="24"/>
+          <w:sz-cs w:val="24"/>
+        </w:rPr>
+        <w:t xml:space="preserve">intent cannot carry a minimum above its maximum. Horizontal desktop filters and product results each</w:t>
+      </w:r>
+    </w:p>
+    <w:p>
+      <w:pPr/>
+      <w:r>
+        <w:rPr>
+          <w:rFonts w:ascii="Helvetica Light" w:hAnsi="Helvetica Light" w:cs="Helvetica Light"/>
+          <w:sz w:val="24"/>
+          <w:sz-cs w:val="24"/>
+        </w:rPr>
+        <w:t xml:space="preserve">occupy a full-width row, while the sidebar variant retains separate filter and product columns. The</w:t>
+      </w:r>
+    </w:p>
+    <w:p>
+      <w:pPr/>
+      <w:r>
+        <w:rPr>
+          <w:rFonts w:ascii="Helvetica Light" w:hAnsi="Helvetica Light" w:cs="Helvetica Light"/>
+          <w:sz w:val="24"/>
+          <w:sz-cs w:val="24"/>
+        </w:rPr>
+        <w:t xml:space="preserve">component performs no product query, filter evaluation, sorting,</w:t>
       </w:r>
     </w:p>
     <w:p>

</xml_diff>

<commit_message>
feat: add dynamic homepage commerce components
</commit_message>
<xml_diff>
--- a/docs/VESKIFY_SDD_v1.2.docx
+++ b/docs/VESKIFY_SDD_v1.2.docx
@@ -8547,6 +8547,457 @@
           <w:sz-cs w:val="24"/>
         </w:rPr>
         <w:t xml:space="preserve">NFR-102, NFR-103, NFR-108 and NFR-109; and AC-111, AC-112, AC-118, AC-122 and AC-123.</w:t>
+      </w:r>
+    </w:p>
+    <w:p>
+      <w:pPr/>
+      <w:r>
+        <w:rPr>
+          <w:rFonts w:ascii="Helvetica Light" w:hAnsi="Helvetica Light" w:cs="Helvetica Light"/>
+          <w:sz w:val="24"/>
+          <w:sz-cs w:val="24"/>
+        </w:rPr>
+        <w:t xml:space="preserve"/>
+      </w:r>
+    </w:p>
+    <w:p>
+      <w:pPr/>
+      <w:r>
+        <w:rPr>
+          <w:rFonts w:ascii="Helvetica Light" w:hAnsi="Helvetica Light" w:cs="Helvetica Light"/>
+          <w:sz w:val="24"/>
+          <w:sz-cs w:val="24"/>
+        </w:rPr>
+        <w:t xml:space="preserve">## 9.8 Registered homepage commerce component family</w:t>
+      </w:r>
+    </w:p>
+    <w:p>
+      <w:pPr/>
+      <w:r>
+        <w:rPr>
+          <w:rFonts w:ascii="Helvetica Light" w:hAnsi="Helvetica Light" w:cs="Helvetica Light"/>
+          <w:sz w:val="24"/>
+          <w:sz-cs w:val="24"/>
+        </w:rPr>
+        <w:t xml:space="preserve">The reusable homepage family consists of six product-type-independent `ComponentDefinitionV2`</w:t>
+      </w:r>
+    </w:p>
+    <w:p>
+      <w:pPr/>
+      <w:r>
+        <w:rPr>
+          <w:rFonts w:ascii="Helvetica Light" w:hAnsi="Helvetica Light" w:cs="Helvetica Light"/>
+          <w:sz w:val="24"/>
+          <w:sz-cs w:val="24"/>
+        </w:rPr>
+        <w:t xml:space="preserve">types: `homepageHero`, `homepageFeaturedCollections`, `homepageFeaturedProducts`,</w:t>
+      </w:r>
+    </w:p>
+    <w:p>
+      <w:pPr/>
+      <w:r>
+        <w:rPr>
+          <w:rFonts w:ascii="Helvetica Light" w:hAnsi="Helvetica Light" w:cs="Helvetica Light"/>
+          <w:sz w:val="24"/>
+          <w:sz-cs w:val="24"/>
+        </w:rPr>
+        <w:t xml:space="preserve">`homepageCollectionNavigation`, `homepagePromotion` and `homepageTrust`. Every type requires a</w:t>
+      </w:r>
+    </w:p>
+    <w:p>
+      <w:pPr/>
+      <w:r>
+        <w:rPr>
+          <w:rFonts w:ascii="Helvetica Light" w:hAnsi="Helvetica Light" w:cs="Helvetica Light"/>
+          <w:sz w:val="24"/>
+          <w:sz-cs w:val="24"/>
+        </w:rPr>
+        <w:t xml:space="preserve">revision-bound `presentationContext` project/brand binding and may reference a revision-bound</w:t>
+      </w:r>
+    </w:p>
+    <w:p>
+      <w:pPr/>
+      <w:r>
+        <w:rPr>
+          <w:rFonts w:ascii="Helvetica Light" w:hAnsi="Helvetica Light" w:cs="Helvetica Light"/>
+          <w:sz w:val="24"/>
+          <w:sz-cs w:val="24"/>
+        </w:rPr>
+        <w:t xml:space="preserve">`copyContext` localized-content source. The same engineering-owned renderer for each type serves</w:t>
+      </w:r>
+    </w:p>
+    <w:p>
+      <w:pPr/>
+      <w:r>
+        <w:rPr>
+          <w:rFonts w:ascii="Helvetica Light" w:hAnsi="Helvetica Light" w:cs="Helvetica Light"/>
+          <w:sz w:val="24"/>
+          <w:sz-cs w:val="24"/>
+        </w:rPr>
+        <w:t xml:space="preserve">editor, preview and published targets.</w:t>
+      </w:r>
+    </w:p>
+    <w:p>
+      <w:pPr/>
+      <w:r>
+        <w:rPr>
+          <w:rFonts w:ascii="Helvetica Light" w:hAnsi="Helvetica Light" w:cs="Helvetica Light"/>
+          <w:sz w:val="24"/>
+          <w:sz-cs w:val="24"/>
+        </w:rPr>
+        <w:t xml:space="preserve"/>
+      </w:r>
+    </w:p>
+    <w:p>
+      <w:pPr/>
+      <w:r>
+        <w:rPr>
+          <w:rFonts w:ascii="Helvetica Light" w:hAnsi="Helvetica Light" w:cs="Helvetica Light"/>
+          <w:sz w:val="24"/>
+          <w:sz-cs w:val="24"/>
+        </w:rPr>
+        <w:t xml:space="preserve">`homepageHero` supports an optional revision-bound `heroAsset` binding and matching optional</w:t>
+      </w:r>
+    </w:p>
+    <w:p>
+      <w:pPr/>
+      <w:r>
+        <w:rPr>
+          <w:rFonts w:ascii="Helvetica Light" w:hAnsi="Helvetica Light" w:cs="Helvetica Light"/>
+          <w:sz w:val="24"/>
+          <w:sz-cs w:val="24"/>
+        </w:rPr>
+        <w:t xml:space="preserve">`heroMedia` assignment, plus optional `primaryAction` and `secondaryAction` navigation bindings.</w:t>
+      </w:r>
+    </w:p>
+    <w:p>
+      <w:pPr/>
+      <w:r>
+        <w:rPr>
+          <w:rFonts w:ascii="Helvetica Light" w:hAnsi="Helvetica Light" w:cs="Helvetica Light"/>
+          <w:sz w:val="24"/>
+          <w:sz-cs w:val="24"/>
+        </w:rPr>
+        <w:t xml:space="preserve">Omitting media hides the media region safely. `homepagePromotion` uses equivalent optional</w:t>
+      </w:r>
+    </w:p>
+    <w:p>
+      <w:pPr/>
+      <w:r>
+        <w:rPr>
+          <w:rFonts w:ascii="Helvetica Light" w:hAnsi="Helvetica Light" w:cs="Helvetica Light"/>
+          <w:sz w:val="24"/>
+          <w:sz-cs w:val="24"/>
+        </w:rPr>
+        <w:t xml:space="preserve">`promotionAsset`, `promotionMedia` and `promotionAction` contracts. A visible action label and its</w:t>
+      </w:r>
+    </w:p>
+    <w:p>
+      <w:pPr/>
+      <w:r>
+        <w:rPr>
+          <w:rFonts w:ascii="Helvetica Light" w:hAnsi="Helvetica Light" w:cs="Helvetica Light"/>
+          <w:sz w:val="24"/>
+          <w:sz-cs w:val="24"/>
+        </w:rPr>
+        <w:t xml:space="preserve">canonical navigation binding must be supplied together; activation emits a typed approved-navigation</w:t>
+      </w:r>
+    </w:p>
+    <w:p>
+      <w:pPr/>
+      <w:r>
+        <w:rPr>
+          <w:rFonts w:ascii="Helvetica Light" w:hAnsi="Helvetica Light" w:cs="Helvetica Light"/>
+          <w:sz w:val="24"/>
+          <w:sz-cs w:val="24"/>
+        </w:rPr>
+        <w:t xml:space="preserve">intent and performs no routing, cart, publishing or other mutation inside the component.</w:t>
+      </w:r>
+    </w:p>
+    <w:p>
+      <w:pPr/>
+      <w:r>
+        <w:rPr>
+          <w:rFonts w:ascii="Helvetica Light" w:hAnsi="Helvetica Light" w:cs="Helvetica Light"/>
+          <w:sz w:val="24"/>
+          <w:sz-cs w:val="24"/>
+        </w:rPr>
+        <w:t xml:space="preserve"/>
+      </w:r>
+    </w:p>
+    <w:p>
+      <w:pPr/>
+      <w:r>
+        <w:rPr>
+          <w:rFonts w:ascii="Helvetica Light" w:hAnsi="Helvetica Light" w:cs="Helvetica Light"/>
+          <w:sz w:val="24"/>
+          <w:sz-cs w:val="24"/>
+        </w:rPr>
+        <w:t xml:space="preserve">`homepageFeaturedCollections` and `homepageCollectionNavigation` consume an ordered,</w:t>
+      </w:r>
+    </w:p>
+    <w:p>
+      <w:pPr/>
+      <w:r>
+        <w:rPr>
+          <w:rFonts w:ascii="Helvetica Light" w:hAnsi="Helvetica Light" w:cs="Helvetica Light"/>
+          <w:sz w:val="24"/>
+          <w:sz-cs w:val="24"/>
+        </w:rPr>
+        <w:t xml:space="preserve">revision-bound `collectionList` binding through the `collections` slot. Optional</w:t>
+      </w:r>
+    </w:p>
+    <w:p>
+      <w:pPr/>
+      <w:r>
+        <w:rPr>
+          <w:rFonts w:ascii="Helvetica Light" w:hAnsi="Helvetica Light" w:cs="Helvetica Light"/>
+          <w:sz w:val="24"/>
+          <w:sz-cs w:val="24"/>
+        </w:rPr>
+        <w:t xml:space="preserve">`collectionMedia` assignments may contain approved collection or editorial assets. Missing compatible</w:t>
+      </w:r>
+    </w:p>
+    <w:p>
+      <w:pPr/>
+      <w:r>
+        <w:rPr>
+          <w:rFonts w:ascii="Helvetica Light" w:hAnsi="Helvetica Light" w:cs="Helvetica Light"/>
+          <w:sz w:val="24"/>
+          <w:sz-cs w:val="24"/>
+        </w:rPr>
+        <w:t xml:space="preserve">media renders a localized placeholder for image presentations and is omitted for text-only</w:t>
+      </w:r>
+    </w:p>
+    <w:p>
+      <w:pPr/>
+      <w:r>
+        <w:rPr>
+          <w:rFonts w:ascii="Helvetica Light" w:hAnsi="Helvetica Light" w:cs="Helvetica Light"/>
+          <w:sz w:val="24"/>
+          <w:sz-cs w:val="24"/>
+        </w:rPr>
+        <w:t xml:space="preserve">presentation. Collection titles, descriptions, IDs and canonical order are resolved from the bound</w:t>
+      </w:r>
+    </w:p>
+    <w:p>
+      <w:pPr/>
+      <w:r>
+        <w:rPr>
+          <w:rFonts w:ascii="Helvetica Light" w:hAnsi="Helvetica Light" w:cs="Helvetica Light"/>
+          <w:sz w:val="24"/>
+          <w:sz-cs w:val="24"/>
+        </w:rPr>
+        <w:t xml:space="preserve">projection rather than editable content.</w:t>
+      </w:r>
+    </w:p>
+    <w:p>
+      <w:pPr/>
+      <w:r>
+        <w:rPr>
+          <w:rFonts w:ascii="Helvetica Light" w:hAnsi="Helvetica Light" w:cs="Helvetica Light"/>
+          <w:sz w:val="24"/>
+          <w:sz-cs w:val="24"/>
+        </w:rPr>
+        <w:t xml:space="preserve"/>
+      </w:r>
+    </w:p>
+    <w:p>
+      <w:pPr/>
+      <w:r>
+        <w:rPr>
+          <w:rFonts w:ascii="Helvetica Light" w:hAnsi="Helvetica Light" w:cs="Helvetica Light"/>
+          <w:sz w:val="24"/>
+          <w:sz-cs w:val="24"/>
+        </w:rPr>
+        <w:t xml:space="preserve">`homepageFeaturedProducts` consumes an ordered, revision-bound `productList` binding through the</w:t>
+      </w:r>
+    </w:p>
+    <w:p>
+      <w:pPr/>
+      <w:r>
+        <w:rPr>
+          <w:rFonts w:ascii="Helvetica Light" w:hAnsi="Helvetica Light" w:cs="Helvetica Light"/>
+          <w:sz w:val="24"/>
+          <w:sz-cs w:val="24"/>
+        </w:rPr>
+        <w:t xml:space="preserve">`products` slot and reuses the canonical product-card presentation shared with collection commerce.</w:t>
+      </w:r>
+    </w:p>
+    <w:p>
+      <w:pPr/>
+      <w:r>
+        <w:rPr>
+          <w:rFonts w:ascii="Helvetica Light" w:hAnsi="Helvetica Light" w:cs="Helvetica Light"/>
+          <w:sz w:val="24"/>
+          <w:sz-cs w:val="24"/>
+        </w:rPr>
+        <w:t xml:space="preserve">Its optional `productMedia` assignments accept approved product-main, product-alternative and</w:t>
+      </w:r>
+    </w:p>
+    <w:p>
+      <w:pPr/>
+      <w:r>
+        <w:rPr>
+          <w:rFonts w:ascii="Helvetica Light" w:hAnsi="Helvetica Light" w:cs="Helvetica Light"/>
+          <w:sz w:val="24"/>
+          <w:sz-cs w:val="24"/>
+        </w:rPr>
+        <w:t xml:space="preserve">editorial assets. Product identity, type, SKU, price, compare-at price, unavailable-price state,</w:t>
+      </w:r>
+    </w:p>
+    <w:p>
+      <w:pPr/>
+      <w:r>
+        <w:rPr>
+          <w:rFonts w:ascii="Helvetica Light" w:hAnsi="Helvetica Light" w:cs="Helvetica Light"/>
+          <w:sz w:val="24"/>
+          <w:sz-cs w:val="24"/>
+        </w:rPr>
+        <w:t xml:space="preserve">availability and media provenance remain read-only projection values. Grid and carousel-style</w:t>
+      </w:r>
+    </w:p>
+    <w:p>
+      <w:pPr/>
+      <w:r>
+        <w:rPr>
+          <w:rFonts w:ascii="Helvetica Light" w:hAnsi="Helvetica Light" w:cs="Helvetica Light"/>
+          <w:sz w:val="24"/>
+          <w:sz-cs w:val="24"/>
+        </w:rPr>
+        <w:t xml:space="preserve">presentation change only responsive layout and card treatment, never product facts.</w:t>
+      </w:r>
+    </w:p>
+    <w:p>
+      <w:pPr/>
+      <w:r>
+        <w:rPr>
+          <w:rFonts w:ascii="Helvetica Light" w:hAnsi="Helvetica Light" w:cs="Helvetica Light"/>
+          <w:sz w:val="24"/>
+          <w:sz-cs w:val="24"/>
+        </w:rPr>
+        <w:t xml:space="preserve"/>
+      </w:r>
+    </w:p>
+    <w:p>
+      <w:pPr/>
+      <w:r>
+        <w:rPr>
+          <w:rFonts w:ascii="Helvetica Light" w:hAnsi="Helvetica Light" w:cs="Helvetica Light"/>
+          <w:sz w:val="24"/>
+          <w:sz-cs w:val="24"/>
+        </w:rPr>
+        <w:t xml:space="preserve">`homepageTrust` accepts structured localized delivery, returns, service and store-support copy plus</w:t>
+      </w:r>
+    </w:p>
+    <w:p>
+      <w:pPr/>
+      <w:r>
+        <w:rPr>
+          <w:rFonts w:ascii="Helvetica Light" w:hAnsi="Helvetica Light" w:cs="Helvetica Light"/>
+          <w:sz w:val="24"/>
+          <w:sz-cs w:val="24"/>
+        </w:rPr>
+        <w:t xml:space="preserve">an optional `supportAction` navigation binding. These items are presentation messages, not logistics,</w:t>
+      </w:r>
+    </w:p>
+    <w:p>
+      <w:pPr/>
+      <w:r>
+        <w:rPr>
+          <w:rFonts w:ascii="Helvetica Light" w:hAnsi="Helvetica Light" w:cs="Helvetica Light"/>
+          <w:sz w:val="24"/>
+          <w:sz-cs w:val="24"/>
+        </w:rPr>
+        <w:t xml:space="preserve">returns, payment, order or store-operation logic. Across the family, editable content is limited to</w:t>
+      </w:r>
+    </w:p>
+    <w:p>
+      <w:pPr/>
+      <w:r>
+        <w:rPr>
+          <w:rFonts w:ascii="Helvetica Light" w:hAnsi="Helvetica Light" w:cs="Helvetica Light"/>
+          <w:sz w:val="24"/>
+          <w:sz-cs w:val="24"/>
+        </w:rPr>
+        <w:t xml:space="preserve">localized marketing/support copy and action labels; editable props and style overrides are strict</w:t>
+      </w:r>
+    </w:p>
+    <w:p>
+      <w:pPr/>
+      <w:r>
+        <w:rPr>
+          <w:rFonts w:ascii="Helvetica Light" w:hAnsi="Helvetica Light" w:cs="Helvetica Light"/>
+          <w:sz w:val="24"/>
+          <w:sz-cs w:val="24"/>
+        </w:rPr>
+        <w:t xml:space="preserve">approved presentation enums and bounded column counts. Unknown fields, bindings and IDs fail</w:t>
+      </w:r>
+    </w:p>
+    <w:p>
+      <w:pPr/>
+      <w:r>
+        <w:rPr>
+          <w:rFonts w:ascii="Helvetica Light" w:hAnsi="Helvetica Light" w:cs="Helvetica Light"/>
+          <w:sz w:val="24"/>
+          <w:sz-cs w:val="24"/>
+        </w:rPr>
+        <w:t xml:space="preserve">validation, arbitrary CSS is not accepted, explicit unknown/rejected/unapproved assets fail</w:t>
+      </w:r>
+    </w:p>
+    <w:p>
+      <w:pPr/>
+      <w:r>
+        <w:rPr>
+          <w:rFonts w:ascii="Helvetica Light" w:hAnsi="Helvetica Light" w:cs="Helvetica Light"/>
+          <w:sz w:val="24"/>
+          <w:sz-cs w:val="24"/>
+        </w:rPr>
+        <w:t xml:space="preserve">conformance, and asset provenance remains attached to every rendered approved image.</w:t>
+      </w:r>
+    </w:p>
+    <w:p>
+      <w:pPr/>
+      <w:r>
+        <w:rPr>
+          <w:rFonts w:ascii="Helvetica Light" w:hAnsi="Helvetica Light" w:cs="Helvetica Light"/>
+          <w:sz w:val="24"/>
+          <w:sz-cs w:val="24"/>
+        </w:rPr>
+        <w:t xml:space="preserve"/>
+      </w:r>
+    </w:p>
+    <w:p>
+      <w:pPr/>
+      <w:r>
+        <w:rPr>
+          <w:rFonts w:ascii="Helvetica Light" w:hAnsi="Helvetica Light" w:cs="Helvetica Light"/>
+          <w:sz w:val="24"/>
+          <w:sz-cs w:val="24"/>
+        </w:rPr>
+        <w:t xml:space="preserve">This family traces to FR-102, FR-107, FR-109, FR-110, FR-114 and FR-118; NFR-101, NFR-102,</w:t>
+      </w:r>
+    </w:p>
+    <w:p>
+      <w:pPr/>
+      <w:r>
+        <w:rPr>
+          <w:rFonts w:ascii="Helvetica Light" w:hAnsi="Helvetica Light" w:cs="Helvetica Light"/>
+          <w:sz w:val="24"/>
+          <w:sz-cs w:val="24"/>
+        </w:rPr>
+        <w:t xml:space="preserve">NFR-103, NFR-108 and NFR-109; and AC-105, AC-111, AC-112, AC-118, AC-119, AC-122, AC-123 and</w:t>
+      </w:r>
+    </w:p>
+    <w:p>
+      <w:pPr/>
+      <w:r>
+        <w:rPr>
+          <w:rFonts w:ascii="Helvetica Light" w:hAnsi="Helvetica Light" w:cs="Helvetica Light"/>
+          <w:sz w:val="24"/>
+          <w:sz-cs w:val="24"/>
+        </w:rPr>
+        <w:t xml:space="preserve">AC-124.</w:t>
       </w:r>
     </w:p>
     <w:p>

</xml_diff>

<commit_message>
fix: address homepage commerce review findings
</commit_message>
<xml_diff>
--- a/docs/VESKIFY_SDD_v1.2.docx
+++ b/docs/VESKIFY_SDD_v1.2.docx
@@ -1,6 +1,6 @@
 
 <file path=word/document.xml><?xml version="1.0" encoding="utf-8"?>
-<w:document xmlns:ve="http://schemas.openxmlformats.org/markup-compatibility/2006" xmlns:o="urn:schemas-microsoft-com:office:office" xmlns:r="http://schemas.openxmlformats.org/officeDocument/2006/relationships" xmlns:v="urn:schemas-microsoft-com:vml" xmlns:wp="http://schemas.openxmlformats.org/drawingml/2006/wordprocessingDrawing" xmlns:w10="urn:schemas-microsoft-com:office:word" xmlns:w="http://schemas.openxmlformats.org/wordprocessingml/2006/main">
+<w:document xmlns:w="http://schemas.openxmlformats.org/wordprocessingml/2006/main">
   <w:body>
     <w:p>
       <w:pPr/>
@@ -8711,7 +8711,29 @@
           <w:sz w:val="24"/>
           <w:sz-cs w:val="24"/>
         </w:rPr>
-        <w:t xml:space="preserve">intent and performs no routing, cart, publishing or other mutation inside the component.</w:t>
+        <w:t xml:space="preserve">intent and performs no routing, cart, publishing or other mutation inside the component. The</w:t>
+      </w:r>
+    </w:p>
+    <w:p>
+      <w:pPr/>
+      <w:r>
+        <w:rPr>
+          <w:rFonts w:ascii="Helvetica Light" w:hAnsi="Helvetica Light" w:cs="Helvetica Light"/>
+          <w:sz w:val="24"/>
+          <w:sz-cs w:val="24"/>
+        </w:rPr>
+        <w:t xml:space="preserve">registered instance validator enforces each label/binding pair before proposal or stored-instance</w:t>
+      </w:r>
+    </w:p>
+    <w:p>
+      <w:pPr/>
+      <w:r>
+        <w:rPr>
+          <w:rFonts w:ascii="Helvetica Light" w:hAnsi="Helvetica Light" w:cs="Helvetica Light"/>
+          <w:sz w:val="24"/>
+          <w:sz-cs w:val="24"/>
+        </w:rPr>
+        <w:t xml:space="preserve">acceptance; the renderer remains only a defensive final boundary.</w:t>
       </w:r>
     </w:p>
     <w:p>
@@ -8788,7 +8810,18 @@
           <w:sz w:val="24"/>
           <w:sz-cs w:val="24"/>
         </w:rPr>
-        <w:t xml:space="preserve">projection rather than editable content.</w:t>
+        <w:t xml:space="preserve">projection rather than editable content. Collection-navigation layouts permit at most four columns,</w:t>
+      </w:r>
+    </w:p>
+    <w:p>
+      <w:pPr/>
+      <w:r>
+        <w:rPr>
+          <w:rFonts w:ascii="Helvetica Light" w:hAnsi="Helvetica Light" w:cs="Helvetica Light"/>
+          <w:sz w:val="24"/>
+          <w:sz-cs w:val="24"/>
+        </w:rPr>
+        <w:t xml:space="preserve">matching their mobile, tablet, desktop and wide responsive metadata.</w:t>
       </w:r>
     </w:p>
     <w:p>
@@ -8843,29 +8876,95 @@
           <w:sz w:val="24"/>
           <w:sz-cs w:val="24"/>
         </w:rPr>
-        <w:t xml:space="preserve">editorial assets. Product identity, type, SKU, price, compare-at price, unavailable-price state,</w:t>
-      </w:r>
-    </w:p>
-    <w:p>
-      <w:pPr/>
-      <w:r>
-        <w:rPr>
-          <w:rFonts w:ascii="Helvetica Light" w:hAnsi="Helvetica Light" w:cs="Helvetica Light"/>
-          <w:sz w:val="24"/>
-          <w:sz-cs w:val="24"/>
-        </w:rPr>
-        <w:t xml:space="preserve">availability and media provenance remain read-only projection values. Grid and carousel-style</w:t>
-      </w:r>
-    </w:p>
-    <w:p>
-      <w:pPr/>
-      <w:r>
-        <w:rPr>
-          <w:rFonts w:ascii="Helvetica Light" w:hAnsi="Helvetica Light" w:cs="Helvetica Light"/>
-          <w:sz w:val="24"/>
-          <w:sz-cs w:val="24"/>
-        </w:rPr>
-        <w:t xml:space="preserve">presentation change only responsive layout and card treatment, never product facts.</w:t>
+        <w:t xml:space="preserve">editorial assets. When assignments are present, they must exactly identify the deterministic first</w:t>
+      </w:r>
+    </w:p>
+    <w:p>
+      <w:pPr/>
+      <w:r>
+        <w:rPr>
+          <w:rFonts w:ascii="Helvetica Light" w:hAnsi="Helvetica Light" w:cs="Helvetica Light"/>
+          <w:sz w:val="24"/>
+          <w:sz-cs w:val="24"/>
+        </w:rPr>
+        <w:t xml:space="preserve">compatible canonical media of the products in the bound list, with matching role, approval and</w:t>
+      </w:r>
+    </w:p>
+    <w:p>
+      <w:pPr/>
+      <w:r>
+        <w:rPr>
+          <w:rFonts w:ascii="Helvetica Light" w:hAnsi="Helvetica Light" w:cs="Helvetica Light"/>
+          <w:sz w:val="24"/>
+          <w:sz-cs w:val="24"/>
+        </w:rPr>
+        <w:t xml:space="preserve">canonical-product-media provenance; unrelated, stale or incomplete assignments fail conformance.</w:t>
+      </w:r>
+    </w:p>
+    <w:p>
+      <w:pPr/>
+      <w:r>
+        <w:rPr>
+          <w:rFonts w:ascii="Helvetica Light" w:hAnsi="Helvetica Light" w:cs="Helvetica Light"/>
+          <w:sz w:val="24"/>
+          <w:sz-cs w:val="24"/>
+        </w:rPr>
+        <w:t xml:space="preserve">When assignments are absent, the renderer may select the same approved canonical media as a</w:t>
+      </w:r>
+    </w:p>
+    <w:p>
+      <w:pPr/>
+      <w:r>
+        <w:rPr>
+          <w:rFonts w:ascii="Helvetica Light" w:hAnsi="Helvetica Light" w:cs="Helvetica Light"/>
+          <w:sz w:val="24"/>
+          <w:sz-cs w:val="24"/>
+        </w:rPr>
+        <w:t xml:space="preserve">read-only fallback. A valid empty product list preserves its section context and renders the strict</w:t>
+      </w:r>
+    </w:p>
+    <w:p>
+      <w:pPr/>
+      <w:r>
+        <w:rPr>
+          <w:rFonts w:ascii="Helvetica Light" w:hAnsi="Helvetica Light" w:cs="Helvetica Light"/>
+          <w:sz w:val="24"/>
+          <w:sz-cs w:val="24"/>
+        </w:rPr>
+        <w:t xml:space="preserve">localized empty-state message without creating an empty grid or carousel control. Product identity,</w:t>
+      </w:r>
+    </w:p>
+    <w:p>
+      <w:pPr/>
+      <w:r>
+        <w:rPr>
+          <w:rFonts w:ascii="Helvetica Light" w:hAnsi="Helvetica Light" w:cs="Helvetica Light"/>
+          <w:sz w:val="24"/>
+          <w:sz-cs w:val="24"/>
+        </w:rPr>
+        <w:t xml:space="preserve">type, SKU, price, compare-at price, unavailable-price state, availability and media provenance remain</w:t>
+      </w:r>
+    </w:p>
+    <w:p>
+      <w:pPr/>
+      <w:r>
+        <w:rPr>
+          <w:rFonts w:ascii="Helvetica Light" w:hAnsi="Helvetica Light" w:cs="Helvetica Light"/>
+          <w:sz w:val="24"/>
+          <w:sz-cs w:val="24"/>
+        </w:rPr>
+        <w:t xml:space="preserve">read-only projection values. Grid and carousel-style presentation change only responsive layout and</w:t>
+      </w:r>
+    </w:p>
+    <w:p>
+      <w:pPr/>
+      <w:r>
+        <w:rPr>
+          <w:rFonts w:ascii="Helvetica Light" w:hAnsi="Helvetica Light" w:cs="Helvetica Light"/>
+          <w:sz w:val="24"/>
+          <w:sz-cs w:val="24"/>
+        </w:rPr>
+        <w:t xml:space="preserve">card treatment, never product facts.</w:t>
       </w:r>
     </w:p>
     <w:p>
@@ -8931,29 +9030,62 @@
           <w:sz w:val="24"/>
           <w:sz-cs w:val="24"/>
         </w:rPr>
-        <w:t xml:space="preserve">approved presentation enums and bounded column counts. Unknown fields, bindings and IDs fail</w:t>
-      </w:r>
-    </w:p>
-    <w:p>
-      <w:pPr/>
-      <w:r>
-        <w:rPr>
-          <w:rFonts w:ascii="Helvetica Light" w:hAnsi="Helvetica Light" w:cs="Helvetica Light"/>
-          <w:sz w:val="24"/>
-          <w:sz-cs w:val="24"/>
-        </w:rPr>
-        <w:t xml:space="preserve">validation, arbitrary CSS is not accepted, explicit unknown/rejected/unapproved assets fail</w:t>
-      </w:r>
-    </w:p>
-    <w:p>
-      <w:pPr/>
-      <w:r>
-        <w:rPr>
-          <w:rFonts w:ascii="Helvetica Light" w:hAnsi="Helvetica Light" w:cs="Helvetica Light"/>
-          <w:sz w:val="24"/>
-          <w:sz-cs w:val="24"/>
-        </w:rPr>
-        <w:t xml:space="preserve">conformance, and asset provenance remains attached to every rendered approved image.</w:t>
+        <w:t xml:space="preserve">approved presentation enums and bounded column counts. Component-specific validation retained by the</w:t>
+      </w:r>
+    </w:p>
+    <w:p>
+      <w:pPr/>
+      <w:r>
+        <w:rPr>
+          <w:rFonts w:ascii="Helvetica Light" w:hAnsi="Helvetica Light" w:cs="Helvetica Light"/>
+          <w:sz w:val="24"/>
+          <w:sz-cs w:val="24"/>
+        </w:rPr>
+        <w:t xml:space="preserve">registry applies the original strict schemas alongside the serializable JSON Schema, so every</w:t>
+      </w:r>
+    </w:p>
+    <w:p>
+      <w:pPr/>
+      <w:r>
+        <w:rPr>
+          <w:rFonts w:ascii="Helvetica Light" w:hAnsi="Helvetica Light" w:cs="Helvetica Light"/>
+          <w:sz w:val="24"/>
+          <w:sz-cs w:val="24"/>
+        </w:rPr>
+        <w:t xml:space="preserve">localized field requires at least one non-empty EN or FI value and trust-item IDs remain unique before</w:t>
+      </w:r>
+    </w:p>
+    <w:p>
+      <w:pPr/>
+      <w:r>
+        <w:rPr>
+          <w:rFonts w:ascii="Helvetica Light" w:hAnsi="Helvetica Light" w:cs="Helvetica Light"/>
+          <w:sz w:val="24"/>
+          <w:sz-cs w:val="24"/>
+        </w:rPr>
+        <w:t xml:space="preserve">proposal, stored-instance or renderer use. Unknown fields, bindings and IDs fail validation,</w:t>
+      </w:r>
+    </w:p>
+    <w:p>
+      <w:pPr/>
+      <w:r>
+        <w:rPr>
+          <w:rFonts w:ascii="Helvetica Light" w:hAnsi="Helvetica Light" w:cs="Helvetica Light"/>
+          <w:sz w:val="24"/>
+          <w:sz-cs w:val="24"/>
+        </w:rPr>
+        <w:t xml:space="preserve">arbitrary CSS is not accepted, explicit unknown/rejected/unapproved assets fail conformance, and</w:t>
+      </w:r>
+    </w:p>
+    <w:p>
+      <w:pPr/>
+      <w:r>
+        <w:rPr>
+          <w:rFonts w:ascii="Helvetica Light" w:hAnsi="Helvetica Light" w:cs="Helvetica Light"/>
+          <w:sz w:val="24"/>
+          <w:sz-cs w:val="24"/>
+        </w:rPr>
+        <w:t xml:space="preserve">asset provenance remains attached to every rendered approved image.</w:t>
       </w:r>
     </w:p>
     <w:p>

</xml_diff>

<commit_message>
test: harden P9 diversity acceptance gate
</commit_message>
<xml_diff>
--- a/docs/VESKIFY_SDD_v1.2.docx
+++ b/docs/VESKIFY_SDD_v1.2.docx
@@ -17592,6 +17592,34 @@
       </w:r>
     </w:p>
     <w:sectPr/>
+    <w:p>
+      <w:r>
+        <w:rPr>
+          <w:b/>
+        </w:rPr>
+        <w:t xml:space="preserve">P9-04D — Objective design-diversity acceptance</w:t>
+      </w:r>
+    </w:p>
+    <w:p>
+      <w:r>
+        <w:t xml:space="preserve">Binding Phase 9 gate — 29 July 2026 Lumo real-AI finding.</w:t>
+      </w:r>
+    </w:p>
+    <w:p>
+      <w:r>
+        <w:t xml:space="preserve">The same canonical project, catalogue and approved assets must produce premiumEditorial, modernTechnical and warmApproachable directions. Homepage, collection and PDP composition must be independently different and coherent; colour-only, typography-only and one-section-only changes fail.</w:t>
+      </w:r>
+    </w:p>
+    <w:p>
+      <w:r>
+        <w:t xml:space="preserve">Acceptance records EN/FI and 375, 768, 1024 and 1440 px results plus one/multiple collections, small/large catalogues and missing optional media. Measured responsive evidence rejects overflow, clipping, overlap and invalid empty space.</w:t>
+      </w:r>
+    </w:p>
+    <w:p>
+      <w:r>
+        <w:t xml:space="preserve">Every output preserves approved asset provenance and correct product/collection ownership and is compared directly with the canonical source-commerce baseline for protected IDs, SKU, price, availability and media truth.</w:t>
+      </w:r>
+    </w:p>
   </w:body>
 </w:document>
 </file>

</xml_diff>